<commit_message>
Update for Add Assignment 01 system info
</commit_message>
<xml_diff>
--- a/_site/Assignment 01/bufrjulie8_system_info.docx
+++ b/_site/Assignment 01/bufrjulie8_system_info.docx
@@ -32,347 +32,6 @@
       </w:pPr>
       <w:r>
         <w:rPr>
-          <w:rStyle w:val="ImportTok"/>
-        </w:rPr>
-        <w:t xml:space="preserve">import</w:t>
-      </w:r>
-      <w:r>
-        <w:rPr>
-          <w:rStyle w:val="NormalTok"/>
-        </w:rPr>
-        <w:t xml:space="preserve"> platform</w:t>
-      </w:r>
-      <w:r>
-        <w:br/>
-      </w:r>
-      <w:r>
-        <w:rPr>
-          <w:rStyle w:val="ImportTok"/>
-        </w:rPr>
-        <w:t xml:space="preserve">import</w:t>
-      </w:r>
-      <w:r>
-        <w:rPr>
-          <w:rStyle w:val="NormalTok"/>
-        </w:rPr>
-        <w:t xml:space="preserve"> psutil</w:t>
-      </w:r>
-      <w:r>
-        <w:br/>
-      </w:r>
-      <w:r>
-        <w:br/>
-      </w:r>
-      <w:r>
-        <w:rPr>
-          <w:rStyle w:val="BuiltInTok"/>
-        </w:rPr>
-        <w:t xml:space="preserve">print</w:t>
-      </w:r>
-      <w:r>
-        <w:rPr>
-          <w:rStyle w:val="NormalTok"/>
-        </w:rPr>
-        <w:t xml:space="preserve">(</w:t>
-      </w:r>
-      <w:r>
-        <w:rPr>
-          <w:rStyle w:val="StringTok"/>
-        </w:rPr>
-        <w:t xml:space="preserve">"Operating System:"</w:t>
-      </w:r>
-      <w:r>
-        <w:rPr>
-          <w:rStyle w:val="NormalTok"/>
-        </w:rPr>
-        <w:t xml:space="preserve">, platform.system(), platform.release())</w:t>
-      </w:r>
-      <w:r>
-        <w:br/>
-      </w:r>
-      <w:r>
-        <w:rPr>
-          <w:rStyle w:val="BuiltInTok"/>
-        </w:rPr>
-        <w:t xml:space="preserve">print</w:t>
-      </w:r>
-      <w:r>
-        <w:rPr>
-          <w:rStyle w:val="NormalTok"/>
-        </w:rPr>
-        <w:t xml:space="preserve">(</w:t>
-      </w:r>
-      <w:r>
-        <w:rPr>
-          <w:rStyle w:val="StringTok"/>
-        </w:rPr>
-        <w:t xml:space="preserve">"Python Version:"</w:t>
-      </w:r>
-      <w:r>
-        <w:rPr>
-          <w:rStyle w:val="NormalTok"/>
-        </w:rPr>
-        <w:t xml:space="preserve">, platform.python_version())</w:t>
-      </w:r>
-      <w:r>
-        <w:br/>
-      </w:r>
-      <w:r>
-        <w:rPr>
-          <w:rStyle w:val="BuiltInTok"/>
-        </w:rPr>
-        <w:t xml:space="preserve">print</w:t>
-      </w:r>
-      <w:r>
-        <w:rPr>
-          <w:rStyle w:val="NormalTok"/>
-        </w:rPr>
-        <w:t xml:space="preserve">(</w:t>
-      </w:r>
-      <w:r>
-        <w:rPr>
-          <w:rStyle w:val="StringTok"/>
-        </w:rPr>
-        <w:t xml:space="preserve">"Machine:"</w:t>
-      </w:r>
-      <w:r>
-        <w:rPr>
-          <w:rStyle w:val="NormalTok"/>
-        </w:rPr>
-        <w:t xml:space="preserve">, platform.machine())</w:t>
-      </w:r>
-      <w:r>
-        <w:br/>
-      </w:r>
-      <w:r>
-        <w:rPr>
-          <w:rStyle w:val="BuiltInTok"/>
-        </w:rPr>
-        <w:t xml:space="preserve">print</w:t>
-      </w:r>
-      <w:r>
-        <w:rPr>
-          <w:rStyle w:val="NormalTok"/>
-        </w:rPr>
-        <w:t xml:space="preserve">(</w:t>
-      </w:r>
-      <w:r>
-        <w:rPr>
-          <w:rStyle w:val="StringTok"/>
-        </w:rPr>
-        <w:t xml:space="preserve">"Processor:"</w:t>
-      </w:r>
-      <w:r>
-        <w:rPr>
-          <w:rStyle w:val="NormalTok"/>
-        </w:rPr>
-        <w:t xml:space="preserve">, platform.processor())</w:t>
-      </w:r>
-      <w:r>
-        <w:br/>
-      </w:r>
-      <w:r>
-        <w:br/>
-      </w:r>
-      <w:r>
-        <w:rPr>
-          <w:rStyle w:val="NormalTok"/>
-        </w:rPr>
-        <w:t xml:space="preserve">mem </w:t>
-      </w:r>
-      <w:r>
-        <w:rPr>
-          <w:rStyle w:val="OperatorTok"/>
-        </w:rPr>
-        <w:t xml:space="preserve">=</w:t>
-      </w:r>
-      <w:r>
-        <w:rPr>
-          <w:rStyle w:val="NormalTok"/>
-        </w:rPr>
-        <w:t xml:space="preserve"> psutil.virtual_memory()</w:t>
-      </w:r>
-      <w:r>
-        <w:br/>
-      </w:r>
-      <w:r>
-        <w:rPr>
-          <w:rStyle w:val="BuiltInTok"/>
-        </w:rPr>
-        <w:t xml:space="preserve">print</w:t>
-      </w:r>
-      <w:r>
-        <w:rPr>
-          <w:rStyle w:val="NormalTok"/>
-        </w:rPr>
-        <w:t xml:space="preserve">(</w:t>
-      </w:r>
-      <w:r>
-        <w:rPr>
-          <w:rStyle w:val="StringTok"/>
-        </w:rPr>
-        <w:t xml:space="preserve">"Total Memory (MB):"</w:t>
-      </w:r>
-      <w:r>
-        <w:rPr>
-          <w:rStyle w:val="NormalTok"/>
-        </w:rPr>
-        <w:t xml:space="preserve">, </w:t>
-      </w:r>
-      <w:r>
-        <w:rPr>
-          <w:rStyle w:val="BuiltInTok"/>
-        </w:rPr>
-        <w:t xml:space="preserve">round</w:t>
-      </w:r>
-      <w:r>
-        <w:rPr>
-          <w:rStyle w:val="NormalTok"/>
-        </w:rPr>
-        <w:t xml:space="preserve">(mem.total </w:t>
-      </w:r>
-      <w:r>
-        <w:rPr>
-          <w:rStyle w:val="OperatorTok"/>
-        </w:rPr>
-        <w:t xml:space="preserve">/</w:t>
-      </w:r>
-      <w:r>
-        <w:rPr>
-          <w:rStyle w:val="NormalTok"/>
-        </w:rPr>
-        <w:t xml:space="preserve"> (</w:t>
-      </w:r>
-      <w:r>
-        <w:rPr>
-          <w:rStyle w:val="DecValTok"/>
-        </w:rPr>
-        <w:t xml:space="preserve">1024</w:t>
-      </w:r>
-      <w:r>
-        <w:rPr>
-          <w:rStyle w:val="OperatorTok"/>
-        </w:rPr>
-        <w:t xml:space="preserve">**</w:t>
-      </w:r>
-      <w:r>
-        <w:rPr>
-          <w:rStyle w:val="DecValTok"/>
-        </w:rPr>
-        <w:t xml:space="preserve">2</w:t>
-      </w:r>
-      <w:r>
-        <w:rPr>
-          <w:rStyle w:val="NormalTok"/>
-        </w:rPr>
-        <w:t xml:space="preserve">), </w:t>
-      </w:r>
-      <w:r>
-        <w:rPr>
-          <w:rStyle w:val="DecValTok"/>
-        </w:rPr>
-        <w:t xml:space="preserve">2</w:t>
-      </w:r>
-      <w:r>
-        <w:rPr>
-          <w:rStyle w:val="NormalTok"/>
-        </w:rPr>
-        <w:t xml:space="preserve">))</w:t>
-      </w:r>
-      <w:r>
-        <w:br/>
-      </w:r>
-      <w:r>
-        <w:rPr>
-          <w:rStyle w:val="BuiltInTok"/>
-        </w:rPr>
-        <w:t xml:space="preserve">print</w:t>
-      </w:r>
-      <w:r>
-        <w:rPr>
-          <w:rStyle w:val="NormalTok"/>
-        </w:rPr>
-        <w:t xml:space="preserve">(</w:t>
-      </w:r>
-      <w:r>
-        <w:rPr>
-          <w:rStyle w:val="StringTok"/>
-        </w:rPr>
-        <w:t xml:space="preserve">"Available Memory (MB):"</w:t>
-      </w:r>
-      <w:r>
-        <w:rPr>
-          <w:rStyle w:val="NormalTok"/>
-        </w:rPr>
-        <w:t xml:space="preserve">, </w:t>
-      </w:r>
-      <w:r>
-        <w:rPr>
-          <w:rStyle w:val="BuiltInTok"/>
-        </w:rPr>
-        <w:t xml:space="preserve">round</w:t>
-      </w:r>
-      <w:r>
-        <w:rPr>
-          <w:rStyle w:val="NormalTok"/>
-        </w:rPr>
-        <w:t xml:space="preserve">(mem.available </w:t>
-      </w:r>
-      <w:r>
-        <w:rPr>
-          <w:rStyle w:val="OperatorTok"/>
-        </w:rPr>
-        <w:t xml:space="preserve">/</w:t>
-      </w:r>
-      <w:r>
-        <w:rPr>
-          <w:rStyle w:val="NormalTok"/>
-        </w:rPr>
-        <w:t xml:space="preserve"> (</w:t>
-      </w:r>
-      <w:r>
-        <w:rPr>
-          <w:rStyle w:val="DecValTok"/>
-        </w:rPr>
-        <w:t xml:space="preserve">1024</w:t>
-      </w:r>
-      <w:r>
-        <w:rPr>
-          <w:rStyle w:val="OperatorTok"/>
-        </w:rPr>
-        <w:t xml:space="preserve">**</w:t>
-      </w:r>
-      <w:r>
-        <w:rPr>
-          <w:rStyle w:val="DecValTok"/>
-        </w:rPr>
-        <w:t xml:space="preserve">2</w:t>
-      </w:r>
-      <w:r>
-        <w:rPr>
-          <w:rStyle w:val="NormalTok"/>
-        </w:rPr>
-        <w:t xml:space="preserve">), </w:t>
-      </w:r>
-      <w:r>
-        <w:rPr>
-          <w:rStyle w:val="DecValTok"/>
-        </w:rPr>
-        <w:t xml:space="preserve">2</w:t>
-      </w:r>
-      <w:r>
-        <w:rPr>
-          <w:rStyle w:val="NormalTok"/>
-        </w:rPr>
-        <w:t xml:space="preserve">))</w:t>
-      </w:r>
-    </w:p>
-    <w:p>
-      <w:pPr>
-        <w:pStyle w:val="SourceCode"/>
-      </w:pPr>
-      <w:r>
-        <w:rPr>
           <w:rStyle w:val="VerbatimChar"/>
         </w:rPr>
         <w:t xml:space="preserve">Operating System: Linux 7.0.0-1004-aws</w:t>
@@ -402,7 +61,7 @@
         <w:rPr>
           <w:rStyle w:val="VerbatimChar"/>
         </w:rPr>
-        <w:t xml:space="preserve">Processor: </w:t>
+        <w:t xml:space="preserve">Processor: Intel(R) Xeon(R) Platinum 8259CL CPU @ 2.50GHz</w:t>
       </w:r>
       <w:r>
         <w:br/>
@@ -420,7 +79,7 @@
         <w:rPr>
           <w:rStyle w:val="VerbatimChar"/>
         </w:rPr>
-        <w:t xml:space="preserve">Available Memory (MB): 3978.47</w:t>
+        <w:t xml:space="preserve">Available Memory (MB): 6311.58</w:t>
       </w:r>
     </w:p>
     <w:sectPr>

</xml_diff>